<commit_message>
feat: add web reassignment offers and demo tooling
</commit_message>
<xml_diff>
--- a/Fase 2/Evidencias Grupales/05_Revision_Daily_Meeting_CitaJusta.docx
+++ b/Fase 2/Evidencias Grupales/05_Revision_Daily_Meeting_CitaJusta.docx
@@ -292,21 +292,8 @@
             <w:vAlign w:val="center"/>
           </w:tcPr>
           <w:p>
-            <w:pPr>
-              <w:rPr/>
-            </w:pPr>
             <w:r>
-              <w:rPr>
-                <w:sz w:val="18"/>
-                <w:szCs w:val="18"/>
-                <w:rtl w:val="0"/>
-              </w:rPr>
-              <w:t xml:space="preserve">1.3</w:t>
-            </w:r>
-            <w:r>
-              <w:rPr>
-                <w:rtl w:val="0"/>
-              </w:rPr>
+              <w:t>1.5</w:t>
             </w:r>
           </w:p>
         </w:tc>
@@ -347,21 +334,8 @@
             <w:vAlign w:val="center"/>
           </w:tcPr>
           <w:p>
-            <w:pPr>
-              <w:rPr/>
-            </w:pPr>
             <w:r>
-              <w:rPr>
-                <w:sz w:val="18"/>
-                <w:szCs w:val="18"/>
-                <w:rtl w:val="0"/>
-              </w:rPr>
-              <w:t xml:space="preserve">Actualizado para primera evaluación</w:t>
-            </w:r>
-            <w:r>
-              <w:rPr>
-                <w:rtl w:val="0"/>
-              </w:rPr>
+              <w:t>Actualizado con cierre técnico y validación integral de HU-022</w:t>
             </w:r>
           </w:p>
         </w:tc>
@@ -402,21 +376,8 @@
             <w:vAlign w:val="center"/>
           </w:tcPr>
           <w:p>
-            <w:pPr>
-              <w:rPr/>
-            </w:pPr>
             <w:r>
-              <w:rPr>
-                <w:sz w:val="18"/>
-                <w:szCs w:val="18"/>
-                <w:rtl w:val="0"/>
-              </w:rPr>
-              <w:t xml:space="preserve">09 de septiembre de 2026</w:t>
-            </w:r>
-            <w:r>
-              <w:rPr>
-                <w:rtl w:val="0"/>
-              </w:rPr>
+              <w:t>20 de septiembre de 2026</w:t>
             </w:r>
           </w:p>
         </w:tc>
@@ -1538,21 +1499,8 @@
             <w:vAlign w:val="center"/>
           </w:tcPr>
           <w:p>
-            <w:pPr>
-              <w:rPr/>
-            </w:pPr>
             <w:r>
-              <w:rPr>
-                <w:sz w:val="17"/>
-                <w:szCs w:val="17"/>
-                <w:rtl w:val="0"/>
-              </w:rPr>
-              <w:t xml:space="preserve">HU-001/002</w:t>
-            </w:r>
-            <w:r>
-              <w:rPr>
-                <w:rtl w:val="0"/>
-              </w:rPr>
+              <w:t>HU-001/002</w:t>
             </w:r>
           </w:p>
         </w:tc>
@@ -1561,21 +1509,8 @@
             <w:vAlign w:val="center"/>
           </w:tcPr>
           <w:p>
-            <w:pPr>
-              <w:rPr/>
-            </w:pPr>
             <w:r>
-              <w:rPr>
-                <w:sz w:val="17"/>
-                <w:szCs w:val="17"/>
-                <w:rtl w:val="0"/>
-              </w:rPr>
-              <w:t xml:space="preserve">Registro, login, sesiones y acceso seguro</w:t>
-            </w:r>
-            <w:r>
-              <w:rPr>
-                <w:rtl w:val="0"/>
-              </w:rPr>
+              <w:t>Registro, login, sesiones y acceso seguro</w:t>
             </w:r>
           </w:p>
         </w:tc>
@@ -1584,21 +1519,8 @@
             <w:vAlign w:val="center"/>
           </w:tcPr>
           <w:p>
-            <w:pPr>
-              <w:rPr/>
-            </w:pPr>
             <w:r>
-              <w:rPr>
-                <w:sz w:val="17"/>
-                <w:szCs w:val="17"/>
-                <w:rtl w:val="0"/>
-              </w:rPr>
-              <w:t xml:space="preserve">Alta/Crítica</w:t>
-            </w:r>
-            <w:r>
-              <w:rPr>
-                <w:rtl w:val="0"/>
-              </w:rPr>
+              <w:t>Alta/Crítica</w:t>
             </w:r>
           </w:p>
         </w:tc>
@@ -1607,21 +1529,8 @@
             <w:vAlign w:val="center"/>
           </w:tcPr>
           <w:p>
-            <w:pPr>
-              <w:rPr/>
-            </w:pPr>
             <w:r>
-              <w:rPr>
-                <w:sz w:val="18"/>
-                <w:szCs w:val="18"/>
-                <w:rtl w:val="0"/>
-              </w:rPr>
-              <w:t xml:space="preserve">Done</w:t>
-            </w:r>
-            <w:r>
-              <w:rPr>
-                <w:rtl w:val="0"/>
-              </w:rPr>
+              <w:t>Done</w:t>
             </w:r>
           </w:p>
         </w:tc>
@@ -1636,21 +1545,8 @@
             <w:vAlign w:val="center"/>
           </w:tcPr>
           <w:p>
-            <w:pPr>
-              <w:rPr/>
-            </w:pPr>
             <w:r>
-              <w:rPr>
-                <w:sz w:val="17"/>
-                <w:szCs w:val="17"/>
-                <w:rtl w:val="0"/>
-              </w:rPr>
-              <w:t xml:space="preserve">HU-003</w:t>
-            </w:r>
-            <w:r>
-              <w:rPr>
-                <w:rtl w:val="0"/>
-              </w:rPr>
+              <w:t>HU-003</w:t>
             </w:r>
           </w:p>
         </w:tc>
@@ -1659,21 +1555,8 @@
             <w:vAlign w:val="center"/>
           </w:tcPr>
           <w:p>
-            <w:pPr>
-              <w:rPr/>
-            </w:pPr>
             <w:r>
-              <w:rPr>
-                <w:sz w:val="17"/>
-                <w:szCs w:val="17"/>
-                <w:rtl w:val="0"/>
-              </w:rPr>
-              <w:t xml:space="preserve">Buscar citas por servicio, sede y disponibilidad</w:t>
-            </w:r>
-            <w:r>
-              <w:rPr>
-                <w:rtl w:val="0"/>
-              </w:rPr>
+              <w:t>Buscar citas por servicio, sede y disponibilidad</w:t>
             </w:r>
           </w:p>
         </w:tc>
@@ -1682,21 +1565,8 @@
             <w:vAlign w:val="center"/>
           </w:tcPr>
           <w:p>
-            <w:pPr>
-              <w:rPr/>
-            </w:pPr>
             <w:r>
-              <w:rPr>
-                <w:sz w:val="17"/>
-                <w:szCs w:val="17"/>
-                <w:rtl w:val="0"/>
-              </w:rPr>
-              <w:t xml:space="preserve">Crítica</w:t>
-            </w:r>
-            <w:r>
-              <w:rPr>
-                <w:rtl w:val="0"/>
-              </w:rPr>
+              <w:t>Crítica</w:t>
             </w:r>
           </w:p>
         </w:tc>
@@ -1705,21 +1575,8 @@
             <w:vAlign w:val="center"/>
           </w:tcPr>
           <w:p>
-            <w:pPr>
-              <w:rPr/>
-            </w:pPr>
             <w:r>
-              <w:rPr>
-                <w:sz w:val="18"/>
-                <w:szCs w:val="18"/>
-                <w:rtl w:val="0"/>
-              </w:rPr>
-              <w:t xml:space="preserve">Done</w:t>
-            </w:r>
-            <w:r>
-              <w:rPr>
-                <w:rtl w:val="0"/>
-              </w:rPr>
+              <w:t>Done</w:t>
             </w:r>
           </w:p>
         </w:tc>
@@ -1734,21 +1591,8 @@
             <w:vAlign w:val="center"/>
           </w:tcPr>
           <w:p>
-            <w:pPr>
-              <w:rPr/>
-            </w:pPr>
             <w:r>
-              <w:rPr>
-                <w:sz w:val="17"/>
-                <w:szCs w:val="17"/>
-                <w:rtl w:val="0"/>
-              </w:rPr>
-              <w:t xml:space="preserve">HU-012/013</w:t>
-            </w:r>
-            <w:r>
-              <w:rPr>
-                <w:rtl w:val="0"/>
-              </w:rPr>
+              <w:t>HU-012/013</w:t>
             </w:r>
           </w:p>
         </w:tc>
@@ -1757,21 +1601,8 @@
             <w:vAlign w:val="center"/>
           </w:tcPr>
           <w:p>
-            <w:pPr>
-              <w:rPr/>
-            </w:pPr>
             <w:r>
-              <w:rPr>
-                <w:sz w:val="17"/>
-                <w:szCs w:val="17"/>
-                <w:rtl w:val="0"/>
-              </w:rPr>
-              <w:t xml:space="preserve">Instituciones, sedes, servicios y profesionales</w:t>
-            </w:r>
-            <w:r>
-              <w:rPr>
-                <w:rtl w:val="0"/>
-              </w:rPr>
+              <w:t>Instituciones, sedes, servicios y profesionales</w:t>
             </w:r>
           </w:p>
         </w:tc>
@@ -1780,21 +1611,8 @@
             <w:vAlign w:val="center"/>
           </w:tcPr>
           <w:p>
-            <w:pPr>
-              <w:rPr/>
-            </w:pPr>
             <w:r>
-              <w:rPr>
-                <w:sz w:val="17"/>
-                <w:szCs w:val="17"/>
-                <w:rtl w:val="0"/>
-              </w:rPr>
-              <w:t xml:space="preserve">Alta</w:t>
-            </w:r>
-            <w:r>
-              <w:rPr>
-                <w:rtl w:val="0"/>
-              </w:rPr>
+              <w:t>Alta</w:t>
             </w:r>
           </w:p>
         </w:tc>
@@ -1803,21 +1621,8 @@
             <w:vAlign w:val="center"/>
           </w:tcPr>
           <w:p>
-            <w:pPr>
-              <w:rPr/>
-            </w:pPr>
             <w:r>
-              <w:rPr>
-                <w:sz w:val="18"/>
-                <w:szCs w:val="18"/>
-                <w:rtl w:val="0"/>
-              </w:rPr>
-              <w:t xml:space="preserve">Done</w:t>
-            </w:r>
-            <w:r>
-              <w:rPr>
-                <w:rtl w:val="0"/>
-              </w:rPr>
+              <w:t>Done</w:t>
             </w:r>
           </w:p>
         </w:tc>
@@ -1832,21 +1637,8 @@
             <w:vAlign w:val="center"/>
           </w:tcPr>
           <w:p>
-            <w:pPr>
-              <w:rPr/>
-            </w:pPr>
             <w:r>
-              <w:rPr>
-                <w:sz w:val="17"/>
-                <w:szCs w:val="17"/>
-                <w:rtl w:val="0"/>
-              </w:rPr>
-              <w:t xml:space="preserve">HU-014/015</w:t>
-            </w:r>
-            <w:r>
-              <w:rPr>
-                <w:rtl w:val="0"/>
-              </w:rPr>
+              <w:t>HU-014/015</w:t>
             </w:r>
           </w:p>
         </w:tc>
@@ -1855,21 +1647,8 @@
             <w:vAlign w:val="center"/>
           </w:tcPr>
           <w:p>
-            <w:pPr>
-              <w:rPr/>
-            </w:pPr>
             <w:r>
-              <w:rPr>
-                <w:sz w:val="17"/>
-                <w:szCs w:val="17"/>
-                <w:rtl w:val="0"/>
-              </w:rPr>
-              <w:t xml:space="preserve">Disponibilidad, cupos y agenda institucional</w:t>
-            </w:r>
-            <w:r>
-              <w:rPr>
-                <w:rtl w:val="0"/>
-              </w:rPr>
+              <w:t>Disponibilidad, cupos y agenda institucional</w:t>
             </w:r>
           </w:p>
         </w:tc>
@@ -1878,21 +1657,8 @@
             <w:vAlign w:val="center"/>
           </w:tcPr>
           <w:p>
-            <w:pPr>
-              <w:rPr/>
-            </w:pPr>
             <w:r>
-              <w:rPr>
-                <w:sz w:val="17"/>
-                <w:szCs w:val="17"/>
-                <w:rtl w:val="0"/>
-              </w:rPr>
-              <w:t xml:space="preserve">Crítica/Alta</w:t>
-            </w:r>
-            <w:r>
-              <w:rPr>
-                <w:rtl w:val="0"/>
-              </w:rPr>
+              <w:t>Crítica/Alta</w:t>
             </w:r>
           </w:p>
         </w:tc>
@@ -1901,21 +1667,8 @@
             <w:vAlign w:val="center"/>
           </w:tcPr>
           <w:p>
-            <w:pPr>
-              <w:rPr/>
-            </w:pPr>
             <w:r>
-              <w:rPr>
-                <w:sz w:val="18"/>
-                <w:szCs w:val="18"/>
-                <w:rtl w:val="0"/>
-              </w:rPr>
-              <w:t xml:space="preserve">En progreso</w:t>
-            </w:r>
-            <w:r>
-              <w:rPr>
-                <w:rtl w:val="0"/>
-              </w:rPr>
+              <w:t>Done</w:t>
             </w:r>
           </w:p>
         </w:tc>
@@ -1930,21 +1683,8 @@
             <w:vAlign w:val="center"/>
           </w:tcPr>
           <w:p>
-            <w:pPr>
-              <w:rPr/>
-            </w:pPr>
             <w:r>
-              <w:rPr>
-                <w:sz w:val="18"/>
-                <w:szCs w:val="18"/>
-                <w:rtl w:val="0"/>
-              </w:rPr>
-              <w:t xml:space="preserve">HU-004</w:t>
-            </w:r>
-            <w:r>
-              <w:rPr>
-                <w:rtl w:val="0"/>
-              </w:rPr>
+              <w:t>HU-004</w:t>
             </w:r>
           </w:p>
         </w:tc>
@@ -1953,21 +1693,8 @@
             <w:vAlign w:val="center"/>
           </w:tcPr>
           <w:p>
-            <w:pPr>
-              <w:rPr/>
-            </w:pPr>
             <w:r>
-              <w:rPr>
-                <w:sz w:val="18"/>
-                <w:szCs w:val="18"/>
-                <w:rtl w:val="0"/>
-              </w:rPr>
-              <w:t xml:space="preserve">Reservar una cita</w:t>
-            </w:r>
-            <w:r>
-              <w:rPr>
-                <w:rtl w:val="0"/>
-              </w:rPr>
+              <w:t>Reservar una cita</w:t>
             </w:r>
           </w:p>
         </w:tc>
@@ -1976,21 +1703,8 @@
             <w:vAlign w:val="center"/>
           </w:tcPr>
           <w:p>
-            <w:pPr>
-              <w:rPr/>
-            </w:pPr>
             <w:r>
-              <w:rPr>
-                <w:sz w:val="18"/>
-                <w:szCs w:val="18"/>
-                <w:rtl w:val="0"/>
-              </w:rPr>
-              <w:t xml:space="preserve">Crítica</w:t>
-            </w:r>
-            <w:r>
-              <w:rPr>
-                <w:rtl w:val="0"/>
-              </w:rPr>
+              <w:t>Crítica</w:t>
             </w:r>
           </w:p>
         </w:tc>
@@ -1999,21 +1713,8 @@
             <w:vAlign w:val="center"/>
           </w:tcPr>
           <w:p>
-            <w:pPr>
-              <w:rPr/>
-            </w:pPr>
             <w:r>
-              <w:rPr>
-                <w:sz w:val="18"/>
-                <w:szCs w:val="18"/>
-                <w:rtl w:val="0"/>
-              </w:rPr>
-              <w:t xml:space="preserve">Done</w:t>
-            </w:r>
-            <w:r>
-              <w:rPr>
-                <w:rtl w:val="0"/>
-              </w:rPr>
+              <w:t>Done</w:t>
             </w:r>
           </w:p>
         </w:tc>
@@ -2028,21 +1729,8 @@
             <w:vAlign w:val="center"/>
           </w:tcPr>
           <w:p>
-            <w:pPr>
-              <w:rPr/>
-            </w:pPr>
             <w:r>
-              <w:rPr>
-                <w:sz w:val="18"/>
-                <w:szCs w:val="18"/>
-                <w:rtl w:val="0"/>
-              </w:rPr>
-              <w:t xml:space="preserve">HU-005/006</w:t>
-            </w:r>
-            <w:r>
-              <w:rPr>
-                <w:rtl w:val="0"/>
-              </w:rPr>
+              <w:t>HU-005/006</w:t>
             </w:r>
           </w:p>
         </w:tc>
@@ -2051,21 +1739,8 @@
             <w:vAlign w:val="center"/>
           </w:tcPr>
           <w:p>
-            <w:pPr>
-              <w:rPr/>
-            </w:pPr>
             <w:r>
-              <w:rPr>
-                <w:sz w:val="18"/>
-                <w:szCs w:val="18"/>
-                <w:rtl w:val="0"/>
-              </w:rPr>
-              <w:t xml:space="preserve">Consulta y cancelación de citas</w:t>
-            </w:r>
-            <w:r>
-              <w:rPr>
-                <w:rtl w:val="0"/>
-              </w:rPr>
+              <w:t>Consulta y cancelación de citas</w:t>
             </w:r>
           </w:p>
         </w:tc>
@@ -2074,21 +1749,8 @@
             <w:vAlign w:val="center"/>
           </w:tcPr>
           <w:p>
-            <w:pPr>
-              <w:rPr/>
-            </w:pPr>
             <w:r>
-              <w:rPr>
-                <w:sz w:val="18"/>
-                <w:szCs w:val="18"/>
-                <w:rtl w:val="0"/>
-              </w:rPr>
-              <w:t xml:space="preserve">Alta/Crítica</w:t>
-            </w:r>
-            <w:r>
-              <w:rPr>
-                <w:rtl w:val="0"/>
-              </w:rPr>
+              <w:t>Alta/Crítica</w:t>
             </w:r>
           </w:p>
         </w:tc>
@@ -2097,21 +1759,8 @@
             <w:vAlign w:val="center"/>
           </w:tcPr>
           <w:p>
-            <w:pPr>
-              <w:rPr/>
-            </w:pPr>
             <w:r>
-              <w:rPr>
-                <w:sz w:val="18"/>
-                <w:szCs w:val="18"/>
-                <w:rtl w:val="0"/>
-              </w:rPr>
-              <w:t xml:space="preserve">Done</w:t>
-            </w:r>
-            <w:r>
-              <w:rPr>
-                <w:rtl w:val="0"/>
-              </w:rPr>
+              <w:t>Done</w:t>
             </w:r>
           </w:p>
         </w:tc>
@@ -2126,21 +1775,8 @@
             <w:vAlign w:val="center"/>
           </w:tcPr>
           <w:p>
-            <w:pPr>
-              <w:rPr/>
-            </w:pPr>
             <w:r>
-              <w:rPr>
-                <w:sz w:val="18"/>
-                <w:szCs w:val="18"/>
-                <w:rtl w:val="0"/>
-              </w:rPr>
-              <w:t xml:space="preserve">HU-007/008</w:t>
-            </w:r>
-            <w:r>
-              <w:rPr>
-                <w:rtl w:val="0"/>
-              </w:rPr>
+              <w:t>HU-007/008/021</w:t>
             </w:r>
           </w:p>
         </w:tc>
@@ -2149,21 +1785,8 @@
             <w:vAlign w:val="center"/>
           </w:tcPr>
           <w:p>
-            <w:pPr>
-              <w:rPr/>
-            </w:pPr>
             <w:r>
-              <w:rPr>
-                <w:sz w:val="18"/>
-                <w:szCs w:val="18"/>
-                <w:rtl w:val="0"/>
-              </w:rPr>
-              <w:t xml:space="preserve">Lista de espera y preferencias</w:t>
-            </w:r>
-            <w:r>
-              <w:rPr>
-                <w:rtl w:val="0"/>
-              </w:rPr>
+              <w:t>Lista de espera, preferencias e integración Web</w:t>
             </w:r>
           </w:p>
         </w:tc>
@@ -2172,21 +1795,8 @@
             <w:vAlign w:val="center"/>
           </w:tcPr>
           <w:p>
-            <w:pPr>
-              <w:rPr/>
-            </w:pPr>
             <w:r>
-              <w:rPr>
-                <w:sz w:val="18"/>
-                <w:szCs w:val="18"/>
-                <w:rtl w:val="0"/>
-              </w:rPr>
-              <w:t xml:space="preserve">Crítica/Alta</w:t>
-            </w:r>
-            <w:r>
-              <w:rPr>
-                <w:rtl w:val="0"/>
-              </w:rPr>
+              <w:t>Crítica/Alta</w:t>
             </w:r>
           </w:p>
         </w:tc>
@@ -2195,21 +1805,8 @@
             <w:vAlign w:val="center"/>
           </w:tcPr>
           <w:p>
-            <w:pPr>
-              <w:rPr/>
-            </w:pPr>
             <w:r>
-              <w:rPr>
-                <w:sz w:val="18"/>
-                <w:szCs w:val="18"/>
-                <w:rtl w:val="0"/>
-              </w:rPr>
-              <w:t xml:space="preserve">Pendiente</w:t>
-            </w:r>
-            <w:r>
-              <w:rPr>
-                <w:rtl w:val="0"/>
-              </w:rPr>
+              <w:t>Done</w:t>
             </w:r>
           </w:p>
         </w:tc>
@@ -2222,84 +1819,32 @@
         <w:tc>
           <w:tcPr/>
           <w:p>
-            <w:pPr>
-              <w:rPr/>
-            </w:pPr>
             <w:r>
-              <w:rPr>
-                <w:sz w:val="18"/>
-                <w:szCs w:val="18"/>
-                <w:rtl w:val="0"/>
-              </w:rPr>
-              <w:t xml:space="preserve">HU-009/010/011/016</w:t>
-            </w:r>
-            <w:r>
-              <w:rPr>
-                <w:rtl w:val="0"/>
-              </w:rPr>
+              <w:t>HU-009/010/011/016/018/022</w:t>
             </w:r>
           </w:p>
         </w:tc>
         <w:tc>
           <w:tcPr/>
           <w:p>
-            <w:pPr>
-              <w:rPr/>
-            </w:pPr>
             <w:r>
-              <w:rPr>
-                <w:sz w:val="18"/>
-                <w:szCs w:val="18"/>
-                <w:rtl w:val="0"/>
-              </w:rPr>
-              <w:t xml:space="preserve">Ofertas y reasignación segura</w:t>
-            </w:r>
-            <w:r>
-              <w:rPr>
-                <w:rtl w:val="0"/>
-              </w:rPr>
+              <w:t>Ofertas, reasignación, políticas e integración Web</w:t>
             </w:r>
           </w:p>
         </w:tc>
         <w:tc>
           <w:tcPr/>
           <w:p>
-            <w:pPr>
-              <w:rPr/>
-            </w:pPr>
             <w:r>
-              <w:rPr>
-                <w:sz w:val="18"/>
-                <w:szCs w:val="18"/>
-                <w:rtl w:val="0"/>
-              </w:rPr>
-              <w:t xml:space="preserve">Crítica</w:t>
-            </w:r>
-            <w:r>
-              <w:rPr>
-                <w:rtl w:val="0"/>
-              </w:rPr>
+              <w:t>Crítica</w:t>
             </w:r>
           </w:p>
         </w:tc>
         <w:tc>
           <w:tcPr/>
           <w:p>
-            <w:pPr>
-              <w:rPr/>
-            </w:pPr>
             <w:r>
-              <w:rPr>
-                <w:sz w:val="18"/>
-                <w:szCs w:val="18"/>
-                <w:rtl w:val="0"/>
-              </w:rPr>
-              <w:t xml:space="preserve">Pendiente</w:t>
-            </w:r>
-            <w:r>
-              <w:rPr>
-                <w:rtl w:val="0"/>
-              </w:rPr>
+              <w:t>Done técnico</w:t>
             </w:r>
           </w:p>
         </w:tc>
@@ -2334,10 +1879,7 @@
         <w:rPr/>
       </w:pPr>
       <w:r>
-        <w:rPr>
-          <w:rtl w:val="0"/>
-        </w:rPr>
-        <w:t xml:space="preserve">Sprint 4: Agenda Base se encuentra cerrado con 8/8 tareas completadas y evidencia técnica validada. El Sprint 5: Citas y Lista de Espera continúa en progreso. De las 8 tareas registradas en su Sprint Backlog, 6 están Done: HU-004 Reserva, HU-005 Mis citas, HU-006 Cancelación, fundación de apps/web, integración funcional Web–API y validación E2E Web/API/PostgreSQL. Las 2 tareas restantes corresponden a HU-007 Lista de espera y HU-008 Preferencias.</w:t>
+        <w:t>Sprint 4: Agenda Base permanece cerrado con 8/8 tareas completadas y evidencia técnica validada. Sprint 5: Citas y Lista de Espera quedó cerrado con sus tareas funcionales y de integración completadas. Sprint 6: Reasignación y Ofertas alcanzó cierre técnico con 8/8 tareas completadas. El backend de HU-009, HU-010, HU-011, HU-016 y HU-018 está implementado; HU-021 fue completada y mergeada mediante PR #89, y HU-022 quedó implementada y validada en la rama feat/web-reassignment-offers, pendiente de commit/PR/merge al momento del corte.</w:t>
       </w:r>
     </w:p>
     <w:tbl>
@@ -2381,21 +1923,8 @@
             <w:vAlign w:val="center"/>
           </w:tcPr>
           <w:p>
-            <w:pPr>
-              <w:rPr/>
-            </w:pPr>
             <w:r>
-              <w:rPr>
-                <w:sz w:val="18"/>
-                <w:szCs w:val="18"/>
-                <w:rtl w:val="0"/>
-              </w:rPr>
-              <w:t xml:space="preserve">Tareas Sprint 5</w:t>
-            </w:r>
-            <w:r>
-              <w:rPr>
-                <w:rtl w:val="0"/>
-              </w:rPr>
+              <w:t>Tareas Sprint 6</w:t>
             </w:r>
           </w:p>
         </w:tc>
@@ -2405,21 +1934,8 @@
             <w:vAlign w:val="center"/>
           </w:tcPr>
           <w:p>
-            <w:pPr>
-              <w:rPr/>
-            </w:pPr>
             <w:r>
-              <w:rPr>
-                <w:sz w:val="18"/>
-                <w:szCs w:val="18"/>
-                <w:rtl w:val="0"/>
-              </w:rPr>
-              <w:t xml:space="preserve">Done</w:t>
-            </w:r>
-            <w:r>
-              <w:rPr>
-                <w:rtl w:val="0"/>
-              </w:rPr>
+              <w:t>Done</w:t>
             </w:r>
           </w:p>
         </w:tc>
@@ -2429,21 +1945,8 @@
             <w:vAlign w:val="center"/>
           </w:tcPr>
           <w:p>
-            <w:pPr>
-              <w:rPr/>
-            </w:pPr>
             <w:r>
-              <w:rPr>
-                <w:sz w:val="18"/>
-                <w:szCs w:val="18"/>
-                <w:rtl w:val="0"/>
-              </w:rPr>
-              <w:t xml:space="preserve">Pendientes</w:t>
-            </w:r>
-            <w:r>
-              <w:rPr>
-                <w:rtl w:val="0"/>
-              </w:rPr>
+              <w:t>En progreso / Pendiente</w:t>
             </w:r>
           </w:p>
         </w:tc>
@@ -2453,21 +1956,8 @@
             <w:vAlign w:val="center"/>
           </w:tcPr>
           <w:p>
-            <w:pPr>
-              <w:rPr/>
-            </w:pPr>
             <w:r>
-              <w:rPr>
-                <w:sz w:val="18"/>
-                <w:szCs w:val="18"/>
-                <w:rtl w:val="0"/>
-              </w:rPr>
-              <w:t xml:space="preserve">Pruebas actuales</w:t>
-            </w:r>
-            <w:r>
-              <w:rPr>
-                <w:rtl w:val="0"/>
-              </w:rPr>
+              <w:t>Pruebas actuales</w:t>
             </w:r>
           </w:p>
         </w:tc>
@@ -2482,21 +1972,8 @@
             <w:vAlign w:val="center"/>
           </w:tcPr>
           <w:p>
-            <w:pPr>
-              <w:rPr/>
-            </w:pPr>
             <w:r>
-              <w:rPr>
-                <w:sz w:val="18"/>
-                <w:szCs w:val="18"/>
-                <w:rtl w:val="0"/>
-              </w:rPr>
-              <w:t xml:space="preserve">8</w:t>
-            </w:r>
-            <w:r>
-              <w:rPr>
-                <w:rtl w:val="0"/>
-              </w:rPr>
+              <w:t>8</w:t>
             </w:r>
           </w:p>
         </w:tc>
@@ -2505,21 +1982,8 @@
             <w:vAlign w:val="center"/>
           </w:tcPr>
           <w:p>
-            <w:pPr>
-              <w:rPr/>
-            </w:pPr>
             <w:r>
-              <w:rPr>
-                <w:sz w:val="18"/>
-                <w:szCs w:val="18"/>
-                <w:rtl w:val="0"/>
-              </w:rPr>
-              <w:t xml:space="preserve">6</w:t>
-            </w:r>
-            <w:r>
-              <w:rPr>
-                <w:rtl w:val="0"/>
-              </w:rPr>
+              <w:t>8</w:t>
             </w:r>
           </w:p>
         </w:tc>
@@ -2528,21 +1992,8 @@
             <w:vAlign w:val="center"/>
           </w:tcPr>
           <w:p>
-            <w:pPr>
-              <w:rPr/>
-            </w:pPr>
             <w:r>
-              <w:rPr>
-                <w:sz w:val="18"/>
-                <w:szCs w:val="18"/>
-                <w:rtl w:val="0"/>
-              </w:rPr>
-              <w:t xml:space="preserve">2</w:t>
-            </w:r>
-            <w:r>
-              <w:rPr>
-                <w:rtl w:val="0"/>
-              </w:rPr>
+              <w:t>0 / 0</w:t>
             </w:r>
           </w:p>
         </w:tc>
@@ -2551,21 +2002,8 @@
             <w:vAlign w:val="center"/>
           </w:tcPr>
           <w:p>
-            <w:pPr>
-              <w:rPr/>
-            </w:pPr>
             <w:r>
-              <w:rPr>
-                <w:sz w:val="18"/>
-                <w:szCs w:val="18"/>
-                <w:rtl w:val="0"/>
-              </w:rPr>
-              <w:t xml:space="preserve">114/114 backend · 39/39 web · 13/13 E2E web</w:t>
-            </w:r>
-            <w:r>
-              <w:rPr>
-                <w:rtl w:val="0"/>
-              </w:rPr>
+              <w:t>71/71 web · 20/20 E2E reasignación · 10/10 tooling</w:t>
             </w:r>
           </w:p>
         </w:tc>
@@ -2619,15 +2057,7 @@
         <w:rPr/>
       </w:pPr>
       <w:r>
-        <w:rPr>
-          <w:rtl w:val="0"/>
-        </w:rPr>
-        <w:t xml:space="preserve">Autenticación con registro, login, refresh rotativo y logout; RBAC y contexto institucional operativos.</w:t>
-      </w:r>
-      <w:r>
-        <w:rPr>
-          <w:rtl w:val="0"/>
-        </w:rPr>
+        <w:t>Backend HU-001 a HU-020 implementado, con autenticación, RBAC, contexto institucional, agenda, citas, lista de espera, reasignación, políticas, operación, reportes y auditoría.</w:t>
       </w:r>
     </w:p>
     <w:p>
@@ -2654,15 +2084,7 @@
         <w:rPr/>
       </w:pPr>
       <w:r>
-        <w:rPr>
-          <w:rtl w:val="0"/>
-        </w:rPr>
-        <w:t xml:space="preserve">API versionada bajo /api/v1 con catálogos reales de instituciones, sedes, servicios, profesionales y consulta de disponibilidad.</w:t>
-      </w:r>
-      <w:r>
-        <w:rPr>
-          <w:rtl w:val="0"/>
-        </w:rPr>
+        <w:t>apps/web consume la API real para autenticación, catálogos, disponibilidad, reserva, confirmación, Mis citas, cancelación, lista de espera/preferencias y ofertas de reasignación.</w:t>
       </w:r>
     </w:p>
     <w:p>
@@ -2689,15 +2111,7 @@
         <w:rPr/>
       </w:pPr>
       <w:r>
-        <w:rPr>
-          <w:rtl w:val="0"/>
-        </w:rPr>
-        <w:t xml:space="preserve">HU-004 – Reserva de citas implementada con transacción Serializable, lockVersion y protección contra doble asignación.</w:t>
-      </w:r>
-      <w:r>
-        <w:rPr>
-          <w:rtl w:val="0"/>
-        </w:rPr>
+        <w:t>HU-021 – Gestión Web de lista de espera y preferencias completada: alta, consulta, persistencia de preferencias y retiro validados contra Web + API + PostgreSQL.</w:t>
       </w:r>
     </w:p>
     <w:p>
@@ -2724,15 +2138,7 @@
         <w:rPr/>
       </w:pPr>
       <w:r>
-        <w:rPr>
-          <w:rtl w:val="0"/>
-        </w:rPr>
-        <w:t xml:space="preserve">HU-005/HU-006 – Consulta autenticada de citas propias y cancelación transaccional e idempotente implementadas.</w:t>
-      </w:r>
-      <w:r>
-        <w:rPr>
-          <w:rtl w:val="0"/>
-        </w:rPr>
+        <w:t>El entorno local fue estabilizado con seed:dev idempotente, check:dev de sólo lectura, provisión de catálogos requeridos y validación fail-fast del proxy de Vite.</w:t>
       </w:r>
     </w:p>
     <w:p>
@@ -2759,15 +2165,7 @@
         <w:rPr/>
       </w:pPr>
       <w:r>
-        <w:rPr>
-          <w:rtl w:val="0"/>
-        </w:rPr>
-        <w:t xml:space="preserve">apps/web integrada con la API real: registro, login, sesión, catálogos, disponibilidad, reserva, confirmación, Mis citas, cancelación, logout y rutas protegidas.</w:t>
-      </w:r>
-      <w:r>
-        <w:rPr>
-          <w:rtl w:val="0"/>
-        </w:rPr>
+        <w:t>Validación actual de HU-022: 71/71 pruebas Web, 10/10 pruebas enfocadas de recipient-offers/reassignment-demo y 20/20 E2E reales de reasignación; build API, build Web + TypeScript, Prisma validate, check:dev y git diff --check correctos.</w:t>
       </w:r>
     </w:p>
     <w:p>
@@ -2794,15 +2192,7 @@
         <w:rPr/>
       </w:pPr>
       <w:r>
-        <w:rPr>
-          <w:rtl w:val="0"/>
-        </w:rPr>
-        <w:t xml:space="preserve">Validación actual: 114/114 pruebas backend, 22/22 E2E appointments, checkpoint PostgreSQL 1/1, 39/39 tests web y 13/13 E2E Web/API/PostgreSQL.</w:t>
-      </w:r>
-      <w:r>
-        <w:rPr>
-          <w:rtl w:val="0"/>
-        </w:rPr>
+        <w:t>PR #89 mergeado a main (merge c291d17) con HU-021 y estabilización del entorno local; ramas locales/remotas antiguas ya integradas fueron limpiadas.</w:t>
       </w:r>
     </w:p>
     <w:p>
@@ -2829,10 +2219,7 @@
         <w:rPr/>
       </w:pPr>
       <w:r>
-        <w:rPr>
-          <w:rtl w:val="0"/>
-        </w:rPr>
-        <w:t xml:space="preserve">La integración web fue validada manualmente de punta a punta y mergeada a main mediante el Pull Request #43.</w:t>
+        <w:t>HU-022 – Gestión Web de ofertas de reasignación completada técnicamente: nuevo GET /api/v1/reassignments/offers/me, ruta /ofertas, expiresAt real, aceptación, rechazo y estados finales. La prueba manual validó oferta vencida sin mutación, ACCEPT con cita AGENDADA transferida y REJECT sin creación de cita para el destinatario.</w:t>
       </w:r>
     </w:p>
     <w:p>
@@ -2909,15 +2296,7 @@
         <w:rPr/>
       </w:pPr>
       <w:r>
-        <w:rPr>
-          <w:rtl w:val="0"/>
-        </w:rPr>
-        <w:t xml:space="preserve">Implementar HU-007 – ingreso a lista de espera.</w:t>
-      </w:r>
-      <w:r>
-        <w:rPr>
-          <w:rtl w:val="0"/>
-        </w:rPr>
+        <w:t>Cerrar administrativamente HU-022: commit, push, Pull Request, merge a main y actualización final del estado visual en GitHub Projects.</w:t>
       </w:r>
     </w:p>
     <w:p>
@@ -2944,15 +2323,7 @@
         <w:rPr/>
       </w:pPr>
       <w:r>
-        <w:rPr>
-          <w:rtl w:val="0"/>
-        </w:rPr>
-        <w:t xml:space="preserve">Implementar HU-008 – preferencias del usuario para la lista de espera.</w:t>
-      </w:r>
-      <w:r>
-        <w:rPr>
-          <w:rtl w:val="0"/>
-        </w:rPr>
+        <w:t>Mantener como evidencia de HU-022 los resultados automáticos y la validación manual Web + API + PostgreSQL de expiración, aceptación y rechazo.</w:t>
       </w:r>
     </w:p>
     <w:p>
@@ -2979,15 +2350,7 @@
         <w:rPr/>
       </w:pPr>
       <w:r>
-        <w:rPr>
-          <w:rtl w:val="0"/>
-        </w:rPr>
-        <w:t xml:space="preserve">Continuar posteriormente con HU-009/010/011/016 – ofertas y reasignación segura de cupos liberados.</w:t>
-      </w:r>
-      <w:r>
-        <w:rPr>
-          <w:rtl w:val="0"/>
-        </w:rPr>
+        <w:t>Continuar con las interfaces institucionales pendientes: agenda operativa, asistencia, administración, reportes y auditoría.</w:t>
       </w:r>
     </w:p>
     <w:p>
@@ -3014,15 +2377,7 @@
         <w:rPr/>
       </w:pPr>
       <w:r>
-        <w:rPr>
-          <w:rtl w:val="0"/>
-        </w:rPr>
-        <w:t xml:space="preserve">Mantener actualizados Product Backlog, Sprint Backlog, Release Plan, Kanban y demás evidencias de la primera evaluación.</w:t>
-      </w:r>
-      <w:r>
-        <w:rPr>
-          <w:rtl w:val="0"/>
-        </w:rPr>
+        <w:t>Mantener sincronizados Product Backlog, Sprint Backlog, Release Plan, Kanban y evidencias Daily con el estado verificable de GitHub.</w:t>
       </w:r>
     </w:p>
     <w:p>
@@ -3049,15 +2404,7 @@
         <w:rPr/>
       </w:pPr>
       <w:r>
-        <w:rPr>
-          <w:rtl w:val="0"/>
-        </w:rPr>
-        <w:t xml:space="preserve">Implementar la aplicación de escritorio Tauri y completar su integración con el backend.</w:t>
-      </w:r>
-      <w:r>
-        <w:rPr>
-          <w:rtl w:val="0"/>
-        </w:rPr>
+        <w:t>Implementar la aplicación de escritorio Tauri cuando el flujo institucional Web esté suficientemente consolidado.</w:t>
       </w:r>
     </w:p>
     <w:p>
@@ -3084,10 +2431,7 @@
         <w:rPr/>
       </w:pPr>
       <w:r>
-        <w:rPr>
-          <w:rtl w:val="0"/>
-        </w:rPr>
-        <w:t xml:space="preserve">Implementar Docker/Docker Compose y formalizar posteriormente pruebas de rendimiento y seguridad.</w:t>
+        <w:t>Mantener como deuda técnica separada la advertencia de pg sobre consultas simultáneas y completar posteriormente Docker/Docker Compose y pruebas de seguridad/rendimiento.</w:t>
       </w:r>
     </w:p>
     <w:p>
@@ -3120,10 +2464,7 @@
         <w:rPr/>
       </w:pPr>
       <w:r>
-        <w:rPr>
-          <w:rtl w:val="0"/>
-        </w:rPr>
-        <w:t xml:space="preserve">Estado: listo para Sprint 4. El Burndown fue reconstruido a partir del historial real de GitHub y Pull Requests, utilizando las horas estimadas de las tareas como trabajo restante. La evidencia muestra 30 h estimadas al inicio, 4 h restantes tras el cierre de S4-T01 a S4-T07 y 0 h al validar S4-T08 con el checkpoint E2E real. Se mantiene como evidencia histórica del cierre del Sprint 4 y no se alteran horas reales no registradas.</w:t>
+        <w:t>Estado: evidencia histórica cerrada del Sprint 4. El Burndown Sprint 4 conserva su reconstrucción basada en hitos reales de GitHub y Pull Requests, con 30 h estimadas al inicio y 0 h restantes tras el checkpoint E2E real. No se modifica porque corresponde a un Sprint ya cerrado.</w:t>
       </w:r>
     </w:p>
     <w:p>
@@ -3165,10 +2506,7 @@
         <w:rPr/>
       </w:pPr>
       <w:r>
-        <w:rPr>
-          <w:rtl w:val="0"/>
-        </w:rPr>
-        <w:t xml:space="preserve">El Release Plan contempla 8 Sprints hasta R1.0. A la fecha de corte: Sprint 1 completo; Sprint 2 parcial; Sprint 3 con avance alto; Sprint 4 completo; Sprint 5 en progreso con 6 de 8 tareas completadas. La integración real del frontend con autenticación, catálogos, disponibilidad y citas ya fue validada y mergeada. El siguiente bloque de trabajo corresponde a HU-007 Lista de espera y HU-008 Preferencias, seguido por el motor de ofertas/reasignación.</w:t>
+        <w:t>El Release Plan mantiene 8 Sprints hasta R1.0. Sprint 5 está cerrado y Sprint 6 alcanzó cierre técnico: el motor de reasignación backend y la experiencia Web de ofertas fueron implementados y validados. Al momento del corte sólo resta integrar la rama de HU-022 a main; el siguiente foco funcional corresponde a interfaces institucionales, seguido de Tauri/Docker y cierre académico.</w:t>
       </w:r>
     </w:p>
     <w:p>
@@ -3200,10 +2538,7 @@
         <w:rPr/>
       </w:pPr>
       <w:r>
-        <w:rPr>
-          <w:rtl w:val="0"/>
-        </w:rPr>
-        <w:t xml:space="preserve">Estado: tablero real disponible en GitHub Projects con columnas Backlog, Ready, In Progress, Review, Testing y Done. Tras el cierre de la integración web, S5-T05 y S5-T08 pueden considerarse Done, dejando Sprint 5 con 6/8 tareas completadas. La evidencia visual actualizada se mantiene en el documento 14_Evidencia_Kanban_CitaJusta y debe corresponder al estado real del tablero al 09 de septiembre de 2026.</w:t>
+        <w:t>Estado: tablero real disponible en GitHub Projects con columnas Backlog, Ready, In Progress, Review, Testing y Done. HU-021 está cerrada como Done. HU-022 ya cumple los criterios técnicos y de validación manual, pero la actualización visual del tablero a Done debe realizarse después del commit/PR/merge de feat/web-reassignment-offers para mantener trazabilidad verificable.</w:t>
       </w:r>
     </w:p>
     <w:p>
@@ -3221,10 +2556,7 @@
         <w:rPr/>
       </w:pPr>
       <w:r>
-        <w:rPr>
-          <w:rtl w:val="0"/>
-        </w:rPr>
-        <w:t xml:space="preserve">Figura / evidencia asociada: tablero Kanban real de CitaJusta en GitHub Projects. Ver 14_Evidencia_Kanban_CitaJusta_ACTUALIZADA_09-09-2026.docx.</w:t>
+        <w:t>Figura / evidencia asociada: tablero Kanban real de CitaJusta en GitHub Projects. Ver 14_Evidencia_Kanban_CitaJusta.docx.</w:t>
       </w:r>
     </w:p>
     <w:p>
@@ -3288,15 +2620,7 @@
         <w:rPr/>
       </w:pPr>
       <w:r>
-        <w:rPr>
-          <w:rtl w:val="0"/>
-        </w:rPr>
-        <w:t xml:space="preserve">No existe actualmente un bloqueo técnico activo en la integración Web–API: PostgreSQL, migraciones, backend, web y E2E del alcance implementado están validados.</w:t>
-      </w:r>
-      <w:r>
-        <w:rPr>
-          <w:rtl w:val="0"/>
-        </w:rPr>
+        <w:t>No existe actualmente un bloqueo técnico activo en persistencia, Prisma, Waitlist u ofertas de reasignación. HU-022 quedó validada de punta a punta y sólo resta su integración administrativa a main.</w:t>
       </w:r>
     </w:p>
     <w:p>
@@ -3323,15 +2647,7 @@
         <w:rPr/>
       </w:pPr>
       <w:r>
-        <w:rPr>
-          <w:rtl w:val="0"/>
-        </w:rPr>
-        <w:t xml:space="preserve">HU-007, HU-008 y el posterior motor de ofertas/reasignación siguen pendientes y constituyen el principal bloque funcional del diferenciador de CitaJusta.</w:t>
-      </w:r>
-      <w:r>
-        <w:rPr>
-          <w:rtl w:val="0"/>
-        </w:rPr>
+        <w:t>La siguiente prioridad funcional pasa a las interfaces institucionales. La selección de profesional específico en preferencias de espera continúa fuera del contrato backend disponible y no debe simularse en la interfaz.</w:t>
       </w:r>
     </w:p>
     <w:p>
@@ -3358,15 +2674,7 @@
         <w:rPr/>
       </w:pPr>
       <w:r>
-        <w:rPr>
-          <w:rtl w:val="0"/>
-        </w:rPr>
-        <w:t xml:space="preserve">Docker/Docker Compose y la aplicación de escritorio Tauri continúan pendientes como entregables técnicos del proyecto.</w:t>
-      </w:r>
-      <w:r>
-        <w:rPr>
-          <w:rtl w:val="0"/>
-        </w:rPr>
+        <w:t>La aplicación institucional completa, Tauri y Docker/Docker Compose continúan pendientes como entregables técnicos posteriores.</w:t>
       </w:r>
     </w:p>
     <w:p>
@@ -3393,10 +2701,7 @@
         <w:rPr/>
       </w:pPr>
       <w:r>
-        <w:rPr>
-          <w:rtl w:val="0"/>
-        </w:rPr>
-        <w:t xml:space="preserve">La documentación académica debe mantenerse sincronizada con el repositorio, el Kanban y los resultados de pruebas para evitar evidencias desfasadas.</w:t>
+        <w:t>Se mantiene como deuda técnica de baja prioridad la advertencia de pg detectada en pruebas concurrentes; no afecta los resultados actuales.</w:t>
       </w:r>
     </w:p>
     <w:p>
@@ -3539,21 +2844,8 @@
             <w:vAlign w:val="center"/>
           </w:tcPr>
           <w:p>
-            <w:pPr>
-              <w:rPr/>
-            </w:pPr>
             <w:r>
-              <w:rPr>
-                <w:sz w:val="16"/>
-                <w:szCs w:val="16"/>
-                <w:rtl w:val="0"/>
-              </w:rPr>
-              <w:t xml:space="preserve">Product Backlog</w:t>
-            </w:r>
-            <w:r>
-              <w:rPr>
-                <w:rtl w:val="0"/>
-              </w:rPr>
+              <w:t>Product Backlog</w:t>
             </w:r>
           </w:p>
         </w:tc>
@@ -3562,21 +2854,8 @@
             <w:vAlign w:val="center"/>
           </w:tcPr>
           <w:p>
-            <w:pPr>
-              <w:rPr/>
-            </w:pPr>
             <w:r>
-              <w:rPr>
-                <w:sz w:val="18"/>
-                <w:szCs w:val="18"/>
-                <w:rtl w:val="0"/>
-              </w:rPr>
-              <w:t xml:space="preserve">Actualizado</w:t>
-            </w:r>
-            <w:r>
-              <w:rPr>
-                <w:rtl w:val="0"/>
-              </w:rPr>
+              <w:t>Actualizado</w:t>
             </w:r>
           </w:p>
         </w:tc>
@@ -3585,21 +2864,8 @@
             <w:vAlign w:val="center"/>
           </w:tcPr>
           <w:p>
-            <w:pPr>
-              <w:rPr/>
-            </w:pPr>
             <w:r>
-              <w:rPr>
-                <w:sz w:val="18"/>
-                <w:szCs w:val="18"/>
-                <w:rtl w:val="0"/>
-              </w:rPr>
-              <w:t xml:space="preserve">06_Product_Backlog_CitaJusta_ACTUALIZADO_09-09-2026.xlsx</w:t>
-            </w:r>
-            <w:r>
-              <w:rPr>
-                <w:rtl w:val="0"/>
-              </w:rPr>
+              <w:t>06_Product_Backlog_CitaJusta.xlsx</w:t>
             </w:r>
           </w:p>
         </w:tc>
@@ -3614,21 +2880,8 @@
             <w:vAlign w:val="center"/>
           </w:tcPr>
           <w:p>
-            <w:pPr>
-              <w:rPr/>
-            </w:pPr>
             <w:r>
-              <w:rPr>
-                <w:sz w:val="16"/>
-                <w:szCs w:val="16"/>
-                <w:rtl w:val="0"/>
-              </w:rPr>
-              <w:t xml:space="preserve">Sprint Backlog</w:t>
-            </w:r>
-            <w:r>
-              <w:rPr>
-                <w:rtl w:val="0"/>
-              </w:rPr>
+              <w:t>Sprint Backlog</w:t>
             </w:r>
           </w:p>
         </w:tc>
@@ -3637,21 +2890,8 @@
             <w:vAlign w:val="center"/>
           </w:tcPr>
           <w:p>
-            <w:pPr>
-              <w:rPr/>
-            </w:pPr>
             <w:r>
-              <w:rPr>
-                <w:sz w:val="18"/>
-                <w:szCs w:val="18"/>
-                <w:rtl w:val="0"/>
-              </w:rPr>
-              <w:t xml:space="preserve">Actualizado</w:t>
-            </w:r>
-            <w:r>
-              <w:rPr>
-                <w:rtl w:val="0"/>
-              </w:rPr>
+              <w:t>Actualizado</w:t>
             </w:r>
           </w:p>
         </w:tc>
@@ -3660,21 +2900,8 @@
             <w:vAlign w:val="center"/>
           </w:tcPr>
           <w:p>
-            <w:pPr>
-              <w:rPr/>
-            </w:pPr>
             <w:r>
-              <w:rPr>
-                <w:sz w:val="18"/>
-                <w:szCs w:val="18"/>
-                <w:rtl w:val="0"/>
-              </w:rPr>
-              <w:t xml:space="preserve">07_Sprint_Backlog_CitaJusta_SPRINT5_09-09-2026.xlsx</w:t>
-            </w:r>
-            <w:r>
-              <w:rPr>
-                <w:rtl w:val="0"/>
-              </w:rPr>
+              <w:t>07_Sprint_Backlog_CitaJusta.xlsx</w:t>
             </w:r>
           </w:p>
         </w:tc>
@@ -3689,21 +2916,8 @@
             <w:vAlign w:val="center"/>
           </w:tcPr>
           <w:p>
-            <w:pPr>
-              <w:rPr/>
-            </w:pPr>
             <w:r>
-              <w:rPr>
-                <w:sz w:val="16"/>
-                <w:szCs w:val="16"/>
-                <w:rtl w:val="0"/>
-              </w:rPr>
-              <w:t xml:space="preserve">Release Plan</w:t>
-            </w:r>
-            <w:r>
-              <w:rPr>
-                <w:rtl w:val="0"/>
-              </w:rPr>
+              <w:t>Release Plan</w:t>
             </w:r>
           </w:p>
         </w:tc>
@@ -3712,21 +2926,8 @@
             <w:vAlign w:val="center"/>
           </w:tcPr>
           <w:p>
-            <w:pPr>
-              <w:rPr/>
-            </w:pPr>
             <w:r>
-              <w:rPr>
-                <w:sz w:val="18"/>
-                <w:szCs w:val="18"/>
-                <w:rtl w:val="0"/>
-              </w:rPr>
-              <w:t xml:space="preserve">Actualizado</w:t>
-            </w:r>
-            <w:r>
-              <w:rPr>
-                <w:rtl w:val="0"/>
-              </w:rPr>
+              <w:t>Actualizado</w:t>
             </w:r>
           </w:p>
         </w:tc>
@@ -3735,21 +2936,8 @@
             <w:vAlign w:val="center"/>
           </w:tcPr>
           <w:p>
-            <w:pPr>
-              <w:rPr/>
-            </w:pPr>
             <w:r>
-              <w:rPr>
-                <w:sz w:val="18"/>
-                <w:szCs w:val="18"/>
-                <w:rtl w:val="0"/>
-              </w:rPr>
-              <w:t xml:space="preserve">13_Release_Plan_CitaJusta_ACTUALIZADO_09-09-2026.xlsx</w:t>
-            </w:r>
-            <w:r>
-              <w:rPr>
-                <w:rtl w:val="0"/>
-              </w:rPr>
+              <w:t>13_Release_Plan_CitaJusta.xlsx</w:t>
             </w:r>
           </w:p>
         </w:tc>
@@ -3764,21 +2952,8 @@
             <w:vAlign w:val="center"/>
           </w:tcPr>
           <w:p>
-            <w:pPr>
-              <w:rPr/>
-            </w:pPr>
             <w:r>
-              <w:rPr>
-                <w:sz w:val="16"/>
-                <w:szCs w:val="16"/>
-                <w:rtl w:val="0"/>
-              </w:rPr>
-              <w:t xml:space="preserve">Burndown</w:t>
-            </w:r>
-            <w:r>
-              <w:rPr>
-                <w:rtl w:val="0"/>
-              </w:rPr>
+              <w:t>Burndown</w:t>
             </w:r>
           </w:p>
         </w:tc>
@@ -3787,21 +2962,8 @@
             <w:vAlign w:val="center"/>
           </w:tcPr>
           <w:p>
-            <w:pPr>
-              <w:rPr/>
-            </w:pPr>
             <w:r>
-              <w:rPr>
-                <w:sz w:val="18"/>
-                <w:szCs w:val="18"/>
-                <w:rtl w:val="0"/>
-              </w:rPr>
-              <w:t xml:space="preserve">Listo / histórico</w:t>
-            </w:r>
-            <w:r>
-              <w:rPr>
-                <w:rtl w:val="0"/>
-              </w:rPr>
+              <w:t>Histórico / sin cambios</w:t>
             </w:r>
           </w:p>
         </w:tc>
@@ -3810,21 +2972,8 @@
             <w:vAlign w:val="center"/>
           </w:tcPr>
           <w:p>
-            <w:pPr>
-              <w:rPr/>
-            </w:pPr>
             <w:r>
-              <w:rPr>
-                <w:sz w:val="18"/>
-                <w:szCs w:val="18"/>
-                <w:rtl w:val="0"/>
-              </w:rPr>
-              <w:t xml:space="preserve">08_Burndown_Sprint_4_CitaJusta.xlsx</w:t>
-            </w:r>
-            <w:r>
-              <w:rPr>
-                <w:rtl w:val="0"/>
-              </w:rPr>
+              <w:t>08_Burndown_Sprint_4_CitaJusta.xlsx</w:t>
             </w:r>
           </w:p>
         </w:tc>
@@ -3839,21 +2988,8 @@
             <w:vAlign w:val="center"/>
           </w:tcPr>
           <w:p>
-            <w:pPr>
-              <w:rPr/>
-            </w:pPr>
             <w:r>
-              <w:rPr>
-                <w:sz w:val="16"/>
-                <w:szCs w:val="16"/>
-                <w:rtl w:val="0"/>
-              </w:rPr>
-              <w:t xml:space="preserve">Kanban</w:t>
-            </w:r>
-            <w:r>
-              <w:rPr>
-                <w:rtl w:val="0"/>
-              </w:rPr>
+              <w:t>Kanban</w:t>
             </w:r>
           </w:p>
         </w:tc>
@@ -3862,21 +2998,8 @@
             <w:vAlign w:val="center"/>
           </w:tcPr>
           <w:p>
-            <w:pPr>
-              <w:rPr/>
-            </w:pPr>
             <w:r>
-              <w:rPr>
-                <w:sz w:val="18"/>
-                <w:szCs w:val="18"/>
-                <w:rtl w:val="0"/>
-              </w:rPr>
-              <w:t xml:space="preserve">Tablero real</w:t>
-            </w:r>
-            <w:r>
-              <w:rPr>
-                <w:rtl w:val="0"/>
-              </w:rPr>
+              <w:t>Actualizado</w:t>
             </w:r>
           </w:p>
         </w:tc>
@@ -3885,21 +3008,8 @@
             <w:vAlign w:val="center"/>
           </w:tcPr>
           <w:p>
-            <w:pPr>
-              <w:rPr/>
-            </w:pPr>
             <w:r>
-              <w:rPr>
-                <w:sz w:val="18"/>
-                <w:szCs w:val="18"/>
-                <w:rtl w:val="0"/>
-              </w:rPr>
-              <w:t xml:space="preserve">14_Evidencia_Kanban_CitaJusta_ACTUALIZADA_09-09-2026.docx</w:t>
-            </w:r>
-            <w:r>
-              <w:rPr>
-                <w:rtl w:val="0"/>
-              </w:rPr>
+              <w:t>14_Evidencia_Kanban_CitaJusta.docx</w:t>
             </w:r>
           </w:p>
         </w:tc>
@@ -3924,10 +3034,7 @@
         <w:rPr/>
       </w:pPr>
       <w:r>
-        <w:rPr>
-          <w:rtl w:val="0"/>
-        </w:rPr>
-        <w:t xml:space="preserve">La revisión evidencia que CitaJusta ya dispone de un flujo web-backend funcional para registro, autenticación, búsqueda de disponibilidad, reserva, consulta y cancelación de citas, validado contra PostgreSQL real. Sprint 4 está cerrado y Sprint 5 avanza con 6 de 8 tareas completadas. El foco inmediato pasa a HU-007 Lista de espera y HU-008 Preferencias, para luego continuar con el motor de recuperación y reasignación de cupos. Las evidencias Scrum y técnicas deben mantenerse alineadas con el estado verificable de GitHub y del repositorio.</w:t>
+        <w:t>La revisión actual evidencia que CitaJusta cuenta con backend HU-001 a HU-020 implementado y flujos Web validados para autenticación, búsqueda, reserva, consulta/cancelación de citas, lista de espera/preferencias y ofertas de reasignación. HU-021 fue completada y mergeada mediante PR #89; HU-022 quedó completada técnicamente con 71/71 pruebas Web, 20/20 E2E reales de reasignación, tooling de desarrollo y validación manual de expiración, aceptación y rechazo. Al momento del corte resta commit/PR/merge de la rama feat/web-reassignment-offers y la actualización final del Kanban.</w:t>
       </w:r>
     </w:p>
     <w:sectPr>

</xml_diff>

<commit_message>
docs: update Scrum evidence for HU-023 and HU-024
</commit_message>
<xml_diff>
--- a/Fase 2/Evidencias Grupales/05_Revision_Daily_Meeting_CitaJusta.docx
+++ b/Fase 2/Evidencias Grupales/05_Revision_Daily_Meeting_CitaJusta.docx
@@ -293,7 +293,7 @@
           </w:tcPr>
           <w:p>
             <w:r>
-              <w:t>1.5</w:t>
+              <w:t>1.6</w:t>
             </w:r>
           </w:p>
         </w:tc>
@@ -335,7 +335,7 @@
           </w:tcPr>
           <w:p>
             <w:r>
-              <w:t>Actualizado con cierre técnico y validación integral de HU-022</w:t>
+              <w:t>Actualizado con HU-023 y HU-024 completadas, mergeadas y validadas</w:t>
             </w:r>
           </w:p>
         </w:tc>
@@ -377,7 +377,7 @@
           </w:tcPr>
           <w:p>
             <w:r>
-              <w:t>20 de septiembre de 2026</w:t>
+              <w:t>21 de septiembre de 2026</w:t>
             </w:r>
           </w:p>
         </w:tc>
@@ -1820,7 +1820,7 @@
           <w:tcPr/>
           <w:p>
             <w:r>
-              <w:t>HU-009/010/011/016/018/022</w:t>
+              <w:t>HU-009/010/011/016/018/022/023</w:t>
             </w:r>
           </w:p>
         </w:tc>
@@ -1828,7 +1828,7 @@
           <w:tcPr/>
           <w:p>
             <w:r>
-              <w:t>Ofertas, reasignación, políticas e integración Web</w:t>
+              <w:t>Ofertas, reasignación, políticas, Web y expiración automática</w:t>
             </w:r>
           </w:p>
         </w:tc>
@@ -1844,7 +1844,45 @@
           <w:tcPr/>
           <w:p>
             <w:r>
-              <w:t>Done técnico</w:t>
+              <w:t>Done</w:t>
+            </w:r>
+          </w:p>
+        </w:tc>
+      </w:tr>
+      <w:tr>
+        <w:trPr>
+          <w:cantSplit w:val="0"/>
+          <w:tblHeader w:val="0"/>
+        </w:trPr>
+        <w:tc>
+          <w:tcPr/>
+          <w:p>
+            <w:r>
+              <w:t>HU-024</w:t>
+            </w:r>
+          </w:p>
+        </w:tc>
+        <w:tc>
+          <w:tcPr/>
+          <w:p>
+            <w:r>
+              <w:t>Notificaciones internas para citas, lista de espera y ofertas</w:t>
+            </w:r>
+          </w:p>
+        </w:tc>
+        <w:tc>
+          <w:tcPr/>
+          <w:p>
+            <w:r>
+              <w:t>Alta</w:t>
+            </w:r>
+          </w:p>
+        </w:tc>
+        <w:tc>
+          <w:tcPr/>
+          <w:p>
+            <w:r>
+              <w:t>Done</w:t>
             </w:r>
           </w:p>
         </w:tc>
@@ -1879,7 +1917,7 @@
         <w:rPr/>
       </w:pPr>
       <w:r>
-        <w:t>Sprint 4: Agenda Base permanece cerrado con 8/8 tareas completadas y evidencia técnica validada. Sprint 5: Citas y Lista de Espera quedó cerrado con sus tareas funcionales y de integración completadas. Sprint 6: Reasignación y Ofertas alcanzó cierre técnico con 8/8 tareas completadas. El backend de HU-009, HU-010, HU-011, HU-016 y HU-018 está implementado; HU-021 fue completada y mergeada mediante PR #89, y HU-022 quedó implementada y validada en la rama feat/web-reassignment-offers, pendiente de commit/PR/merge al momento del corte.</w:t>
+        <w:t>Sprint 4: Agenda Base permanece cerrado con 8/8 tareas completadas. Sprint 5: Citas y Lista de Espera permanece cerrado. Sprint 6 fue refinado para completar los requisitos MVP pendientes del motor de reasignación y comunicación interna, cerrando 10/10 tareas: HU-021/HU-022 Web, HU-023 expiración automática/continuidad y HU-024 notificaciones internas quedaron implementadas, validadas y mergeadas a main.</w:t>
       </w:r>
     </w:p>
     <w:tbl>
@@ -1973,7 +2011,7 @@
           </w:tcPr>
           <w:p>
             <w:r>
-              <w:t>8</w:t>
+              <w:t>10</w:t>
             </w:r>
           </w:p>
         </w:tc>
@@ -1983,7 +2021,7 @@
           </w:tcPr>
           <w:p>
             <w:r>
-              <w:t>8</w:t>
+              <w:t>10</w:t>
             </w:r>
           </w:p>
         </w:tc>
@@ -2003,7 +2041,7 @@
           </w:tcPr>
           <w:p>
             <w:r>
-              <w:t>71/71 web · 20/20 E2E reasignación · 10/10 tooling</w:t>
+              <w:t>HU-023: API 368/368 + expiry 10/10 · HU-024: Web 83/83 + notifications 8/8</w:t>
             </w:r>
           </w:p>
         </w:tc>
@@ -2084,7 +2122,7 @@
         <w:rPr/>
       </w:pPr>
       <w:r>
-        <w:t>apps/web consume la API real para autenticación, catálogos, disponibilidad, reserva, confirmación, Mis citas, cancelación, lista de espera/preferencias y ofertas de reasignación.</w:t>
+        <w:t>apps/web consume la API real para autenticación, catálogos, disponibilidad, reserva, Mis citas, cancelación, lista de espera/preferencias, ofertas de reasignación y centro de notificaciones internas.</w:t>
       </w:r>
     </w:p>
     <w:p>
@@ -2111,7 +2149,7 @@
         <w:rPr/>
       </w:pPr>
       <w:r>
-        <w:t>HU-021 – Gestión Web de lista de espera y preferencias completada: alta, consulta, persistencia de preferencias y retiro validados contra Web + API + PostgreSQL.</w:t>
+        <w:t>HU-021 y HU-022 quedaron completadas y mergeadas: PR #89 (merge c291d17) para lista de espera/preferencias Web y PR #93 (merge 5701ab7) para ofertas de reasignación Web.</w:t>
       </w:r>
     </w:p>
     <w:p>
@@ -2138,7 +2176,7 @@
         <w:rPr/>
       </w:pPr>
       <w:r>
-        <w:t>El entorno local fue estabilizado con seed:dev idempotente, check:dev de sólo lectura, provisión de catálogos requeridos y validación fail-fast del proxy de Vite.</w:t>
+        <w:t>HU-023 – Expiración automática y continuidad completada mediante PR #96 (merge 109b1c9): runner interno, transición PENDING → EXPIRED, continuidad al siguiente candidato, cierres EXHAUSTED/CANCELLED/FAILED controlados y auditoría OFFER_EXPIRED.</w:t>
       </w:r>
     </w:p>
     <w:p>
@@ -2165,7 +2203,7 @@
         <w:rPr/>
       </w:pPr>
       <w:r>
-        <w:t>Validación actual de HU-022: 71/71 pruebas Web, 10/10 pruebas enfocadas de recipient-offers/reassignment-demo y 20/20 E2E reales de reasignación; build API, build Web + TypeScript, Prisma validate, check:dev y git diff --check correctos.</w:t>
+        <w:t>HU-024 – Notificaciones internas completada mediante PR #99 (merge b1bff30): ocho eventos de dominio, deduplicación transaccional, API /notifications/me, contador de no leídas, lectura individual y centro Web /notificaciones.</w:t>
       </w:r>
     </w:p>
     <w:p>
@@ -2192,7 +2230,7 @@
         <w:rPr/>
       </w:pPr>
       <w:r>
-        <w:t>PR #89 mergeado a main (merge c291d17) con HU-021 y estabilización del entorno local; ramas locales/remotas antiguas ya integradas fueron limpiadas.</w:t>
+        <w:t>Validación HU-023: API 368/368, E2E expiración 10/10, reasignaciones 20/20, auditoría 11/11, política 13/13, reports 15/15 y checkpoint 1/1. Validación HU-024: unitarios nuevos 6/6, E2E notifications 8/8, API dirigida 157/157, regresión crítica 87/87, reports 15/15, demo 7/7 y Web 83/83.</w:t>
       </w:r>
     </w:p>
     <w:p>
@@ -2219,7 +2257,7 @@
         <w:rPr/>
       </w:pPr>
       <w:r>
-        <w:t>HU-022 – Gestión Web de ofertas de reasignación completada técnicamente: nuevo GET /api/v1/reassignments/offers/me, ruta /ofertas, expiresAt real, aceptación, rechazo y estados finales. La prueba manual validó oferta vencida sin mutación, ACCEPT con cita AGENDADA transferida y REJECT sin creación de cita para el destinatario.</w:t>
+        <w:t>Prueba manual HU-024 completada: WAITLIST_ENTERED visible en /notificaciones, contador de no leídas, marcado como leída persistente, actualización inmediata del Header y restauración correcta después de logout/login.</w:t>
       </w:r>
     </w:p>
     <w:p>
@@ -2296,7 +2334,7 @@
         <w:rPr/>
       </w:pPr>
       <w:r>
-        <w:t>Cerrar administrativamente HU-022: commit, push, Pull Request, merge a main y actualización final del estado visual en GitHub Projects.</w:t>
+        <w:t>Actualizar y mantener sincronizadas las evidencias Scrum con los cierres de HU-023 y HU-024 y con los merges PR #96/#99.</w:t>
       </w:r>
     </w:p>
     <w:p>
@@ -2323,7 +2361,7 @@
         <w:rPr/>
       </w:pPr>
       <w:r>
-        <w:t>Mantener como evidencia de HU-022 los resultados automáticos y la validación manual Web + API + PostgreSQL de expiración, aceptación y rechazo.</w:t>
+        <w:t>Revisar contra alcance y bocetos si queda alguna pantalla Web de usuario pendiente antes de iniciar la aplicación institucional de escritorio.</w:t>
       </w:r>
     </w:p>
     <w:p>
@@ -2350,7 +2388,7 @@
         <w:rPr/>
       </w:pPr>
       <w:r>
-        <w:t>Continuar con las interfaces institucionales pendientes: agenda operativa, asistencia, administración, reportes y auditoría.</w:t>
+        <w:t>Iniciar el siguiente bloque de trabajo con la fundación de la aplicación institucional de escritorio y las interfaces administrativas ya soportadas por el backend.</w:t>
       </w:r>
     </w:p>
     <w:p>
@@ -2377,7 +2415,7 @@
         <w:rPr/>
       </w:pPr>
       <w:r>
-        <w:t>Mantener sincronizados Product Backlog, Sprint Backlog, Release Plan, Kanban y evidencias Daily con el estado verificable de GitHub.</w:t>
+        <w:t>Mantener sincronizados Product Backlog, Sprint Backlog, Release Plan, Kanban, Issues y Daily Scrum con el estado verificable de GitHub.</w:t>
       </w:r>
     </w:p>
     <w:p>
@@ -2404,7 +2442,7 @@
         <w:rPr/>
       </w:pPr>
       <w:r>
-        <w:t>Implementar la aplicación de escritorio Tauri cuando el flujo institucional Web esté suficientemente consolidado.</w:t>
+        <w:t>Planificar las integraciones externas (correo, OAuth, Calendar, Maps y WhatsApp) después de consolidar el núcleo MVP y mediante adaptadores del backend, sin acoplar reglas de negocio a proveedores.</w:t>
       </w:r>
     </w:p>
     <w:p>
@@ -2431,7 +2469,7 @@
         <w:rPr/>
       </w:pPr>
       <w:r>
-        <w:t>Mantener como deuda técnica separada la advertencia de pg sobre consultas simultáneas y completar posteriormente Docker/Docker Compose y pruebas de seguridad/rendimiento.</w:t>
+        <w:t>Mantener como deuda técnica separada la advertencia de pg sobre consultas simultáneas y completar posteriormente Docker/Docker Compose, OpenAPI/Swagger y pruebas de seguridad/rendimiento.</w:t>
       </w:r>
     </w:p>
     <w:p>
@@ -2506,7 +2544,7 @@
         <w:rPr/>
       </w:pPr>
       <w:r>
-        <w:t>El Release Plan mantiene 8 Sprints hasta R1.0. Sprint 5 está cerrado y Sprint 6 alcanzó cierre técnico: el motor de reasignación backend y la experiencia Web de ofertas fueron implementados y validados. Al momento del corte sólo resta integrar la rama de HU-022 a main; el siguiente foco funcional corresponde a interfaces institucionales, seguido de Tauri/Docker y cierre académico.</w:t>
+        <w:t>El Release Plan mantiene 8 Sprints hasta R1.0. Sprint 6 queda cerrado con el motor de reasignación completo, expiración automática real y notificaciones internas; HU-023 fue mergeada por PR #96 y HU-024 por PR #99. El siguiente foco funcional corresponde al cierre de la experiencia Web de usuario frente al alcance y al inicio de la aplicación institucional de escritorio.</w:t>
       </w:r>
     </w:p>
     <w:p>
@@ -2538,7 +2576,7 @@
         <w:rPr/>
       </w:pPr>
       <w:r>
-        <w:t>Estado: tablero real disponible en GitHub Projects con columnas Backlog, Ready, In Progress, Review, Testing y Done. HU-021 está cerrada como Done. HU-022 ya cumple los criterios técnicos y de validación manual, pero la actualización visual del tablero a Done debe realizarse después del commit/PR/merge de feat/web-reassignment-offers para mantener trazabilidad verificable.</w:t>
+        <w:t>Estado: tablero real disponible en GitHub Projects con columnas Backlog, Ready, In Progress, Review, Testing y Done. HU-021, HU-022 y HU-023 cuentan con evidencia visual/merge de cierre; HU-024 está mergeada a main mediante PR #99 y corresponde mantener el tablero visual sincronizado con ese cierre.</w:t>
       </w:r>
     </w:p>
     <w:p>
@@ -2620,7 +2658,7 @@
         <w:rPr/>
       </w:pPr>
       <w:r>
-        <w:t>No existe actualmente un bloqueo técnico activo en persistencia, Prisma, Waitlist u ofertas de reasignación. HU-022 quedó validada de punta a punta y sólo resta su integración administrativa a main.</w:t>
+        <w:t>No existe actualmente un bloqueo técnico activo en persistencia, Prisma, reasignación, expiración automática o notificaciones internas. HU-023 y HU-024 fueron validadas y mergeadas a main.</w:t>
       </w:r>
     </w:p>
     <w:p>
@@ -2647,7 +2685,7 @@
         <w:rPr/>
       </w:pPr>
       <w:r>
-        <w:t>La siguiente prioridad funcional pasa a las interfaces institucionales. La selección de profesional específico en preferencias de espera continúa fuera del contrato backend disponible y no debe simularse en la interfaz.</w:t>
+        <w:t>La siguiente prioridad funcional es ordenar el cierre de la experiencia Web del usuario frente al alcance/bocetos y luego iniciar la aplicación institucional de escritorio. La administración de sedes, servicios, profesionales, disponibilidad, agenda, reportes y auditoría corresponde al ámbito institucional.</w:t>
       </w:r>
     </w:p>
     <w:p>
@@ -2674,7 +2712,7 @@
         <w:rPr/>
       </w:pPr>
       <w:r>
-        <w:t>La aplicación institucional completa, Tauri y Docker/Docker Compose continúan pendientes como entregables técnicos posteriores.</w:t>
+        <w:t>La aplicación institucional Tauri y Docker/Docker Compose continúan pendientes como entregables técnicos posteriores.</w:t>
       </w:r>
     </w:p>
     <w:p>
@@ -3034,7 +3072,7 @@
         <w:rPr/>
       </w:pPr>
       <w:r>
-        <w:t>La revisión actual evidencia que CitaJusta cuenta con backend HU-001 a HU-020 implementado y flujos Web validados para autenticación, búsqueda, reserva, consulta/cancelación de citas, lista de espera/preferencias y ofertas de reasignación. HU-021 fue completada y mergeada mediante PR #89; HU-022 quedó completada técnicamente con 71/71 pruebas Web, 20/20 E2E reales de reasignación, tooling de desarrollo y validación manual de expiración, aceptación y rechazo. Al momento del corte resta commit/PR/merge de la rama feat/web-reassignment-offers y la actualización final del Kanban.</w:t>
+        <w:t>La revisión actual evidencia que CitaJusta cuenta con backend HU-001 a HU-020 implementado y con HU-021 a HU-024 cerradas e integradas. HU-023 completó RF-029/RF-030 mediante expiración automática y continuidad segura; HU-024 completó RF-034 con notificaciones internas persistentes y centro Web. Los merges principales son PR #96 → 109b1c9 y PR #99 → b1bff30. El proyecto queda preparado para revisar el cierre de la Web de usuario y continuar con la aplicación institucional de escritorio.</w:t>
       </w:r>
     </w:p>
     <w:sectPr>

</xml_diff>